<commit_message>
Adding support for PS4 controller
</commit_message>
<xml_diff>
--- a/UniBot Project Report.docx
+++ b/UniBot Project Report.docx
@@ -106,21 +106,12 @@
         </w:rPr>
         <w:t xml:space="preserve">Mentored by Mrs. </w:t>
       </w:r>
-      <w:proofErr w:type="spellStart"/>
       <w:r>
         <w:rPr>
           <w:sz w:val="56"/>
           <w:lang w:val="en-US"/>
         </w:rPr>
-        <w:t>Kamakshi</w:t>
-      </w:r>
-      <w:proofErr w:type="spellEnd"/>
-      <w:r>
-        <w:rPr>
-          <w:sz w:val="56"/>
-          <w:lang w:val="en-US"/>
-        </w:rPr>
-        <w:t xml:space="preserve"> J</w:t>
+        <w:t>Kamakshi J</w:t>
       </w:r>
     </w:p>
     <w:p>
@@ -241,8 +232,6 @@
           </wp:inline>
         </w:drawing>
       </w:r>
-      <w:bookmarkStart w:id="0" w:name="_GoBack"/>
-      <w:bookmarkEnd w:id="0"/>
     </w:p>
     <w:p>
       <w:pPr>
@@ -469,7 +458,7 @@
     </w:p>
     <w:p>
       <w:pPr>
-        <w:pStyle w:val="Heading1"/>
+        <w:ind w:left="1440"/>
         <w:rPr>
           <w:lang w:val="en-US"/>
         </w:rPr>
@@ -480,146 +469,8 @@
         </w:rPr>
         <w:tab/>
       </w:r>
-      <w:r>
-        <w:rPr>
-          <w:lang w:val="en-US"/>
-        </w:rPr>
-        <w:tab/>
-      </w:r>
-      <w:r>
-        <w:rPr>
-          <w:sz w:val="40"/>
-          <w:lang w:val="en-US"/>
-        </w:rPr>
-        <w:t>Muhammad Fayaazullah F</w:t>
-      </w:r>
-    </w:p>
-    <w:p>
-      <w:pPr>
-        <w:ind w:left="1440"/>
-        <w:rPr>
-          <w:lang w:val="en-US"/>
-        </w:rPr>
-      </w:pPr>
-      <w:r>
-        <w:rPr>
-          <w:lang w:val="en-US"/>
-        </w:rPr>
-        <w:t xml:space="preserve">An unofficial app developer with a deep dive into robotics, </w:t>
-      </w:r>
-      <w:r>
-        <w:rPr>
-          <w:lang w:val="en-US"/>
-        </w:rPr>
-        <w:t>crafting innovative solutions</w:t>
-      </w:r>
-      <w:r>
-        <w:rPr>
-          <w:lang w:val="en-US"/>
-        </w:rPr>
-        <w:t xml:space="preserve"> at the intersection of technology and creativity,</w:t>
-      </w:r>
-    </w:p>
-    <w:p>
-      <w:pPr>
-        <w:pStyle w:val="Heading1"/>
-        <w:rPr>
-          <w:sz w:val="40"/>
-          <w:lang w:val="en-US"/>
-        </w:rPr>
-      </w:pPr>
-      <w:r>
-        <w:rPr>
-          <w:lang w:val="en-US"/>
-        </w:rPr>
-        <w:tab/>
-      </w:r>
-      <w:r>
-        <w:rPr>
-          <w:lang w:val="en-US"/>
-        </w:rPr>
-        <w:tab/>
-      </w:r>
-      <w:r>
-        <w:rPr>
-          <w:sz w:val="40"/>
-          <w:lang w:val="en-US"/>
-        </w:rPr>
-        <w:t>Sahithian T R</w:t>
-      </w:r>
-    </w:p>
-    <w:p>
-      <w:pPr>
-        <w:ind w:left="1440"/>
-        <w:rPr>
-          <w:lang w:val="en-US"/>
-        </w:rPr>
-      </w:pPr>
-      <w:r>
-        <w:rPr>
-          <w:lang w:val="en-US"/>
-        </w:rPr>
-        <w:t>Robotics enthusiast and loves to take part in different adventurous journeys. Key guitarist of his band, “HEXUS”.</w:t>
-      </w:r>
-    </w:p>
-    <w:p>
-      <w:pPr>
-        <w:pStyle w:val="Heading1"/>
-        <w:rPr>
-          <w:lang w:val="en-US"/>
-        </w:rPr>
-      </w:pPr>
-      <w:r>
-        <w:rPr>
-          <w:lang w:val="en-US"/>
-        </w:rPr>
-        <w:tab/>
-      </w:r>
-      <w:r>
-        <w:rPr>
-          <w:lang w:val="en-US"/>
-        </w:rPr>
-        <w:tab/>
-      </w:r>
-      <w:r>
-        <w:rPr>
-          <w:sz w:val="40"/>
-          <w:lang w:val="en-US"/>
-        </w:rPr>
-        <w:t>Senthil Arasu J</w:t>
-      </w:r>
-    </w:p>
-    <w:p>
-      <w:pPr>
-        <w:ind w:left="1440"/>
-        <w:rPr>
-          <w:lang w:val="en-US"/>
-        </w:rPr>
-      </w:pPr>
-      <w:r>
-        <w:rPr>
-          <w:lang w:val="en-US"/>
-        </w:rPr>
-        <w:t xml:space="preserve">Touched the field of Computers and transistors at the age of 10, continuing the journey ranging from Bare Metal </w:t>
-      </w:r>
-      <w:r>
-        <w:rPr>
-          <w:lang w:val="en-US"/>
-        </w:rPr>
-        <w:t xml:space="preserve">Machine </w:t>
-      </w:r>
-      <w:r>
-        <w:rPr>
-          <w:lang w:val="en-US"/>
-        </w:rPr>
-        <w:t>Hardware</w:t>
-      </w:r>
-      <w:r>
-        <w:rPr>
-          <w:lang w:val="en-US"/>
-        </w:rPr>
-        <w:t xml:space="preserve"> to SoC Processors</w:t>
-      </w:r>
+      <w:bookmarkStart w:id="0" w:name="_GoBack"/>
+      <w:bookmarkEnd w:id="0"/>
     </w:p>
     <w:p>
       <w:pPr>
@@ -683,7 +534,6 @@
         <w:pStyle w:val="Title"/>
       </w:pPr>
       <w:r>
-        <w:lastRenderedPageBreak/>
         <w:t>UniBot</w:t>
       </w:r>
     </w:p>
@@ -746,6 +596,7 @@
         <w:rPr>
           <w:sz w:val="48"/>
         </w:rPr>
+        <w:lastRenderedPageBreak/>
         <w:t>What can UniBot do?</w:t>
       </w:r>
     </w:p>
@@ -1038,45 +889,51 @@
         <w:pStyle w:val="Title"/>
       </w:pPr>
       <w:r>
+        <w:t xml:space="preserve">UniBot - </w:t>
+      </w:r>
+      <w:r>
+        <w:t>Synopsis</w:t>
+      </w:r>
+    </w:p>
+    <w:p>
+      <w:pPr>
+        <w:rPr>
+          <w:lang w:val="en-US"/>
+        </w:rPr>
+      </w:pPr>
+    </w:p>
+    <w:p>
+      <w:pPr>
+        <w:pStyle w:val="Heading1"/>
+        <w:rPr>
+          <w:lang w:val="en-US"/>
+        </w:rPr>
+      </w:pPr>
+      <w:r>
+        <w:rPr>
+          <w:lang w:val="en-US"/>
+        </w:rPr>
+        <w:t>Introduction</w:t>
+      </w:r>
+    </w:p>
+    <w:p>
+      <w:pPr>
+        <w:rPr>
+          <w:lang w:val="en-US"/>
+        </w:rPr>
+      </w:pPr>
+      <w:r>
+        <w:rPr>
+          <w:lang w:val="en-US"/>
+        </w:rPr>
+        <w:t xml:space="preserve">UniBot possess the immense power, technology and structure to transform our world into a simple, quick and effortlessly functioning one. UniBot has been engineered to </w:t>
+      </w:r>
+      <w:r>
+        <w:rPr>
+          <w:lang w:val="en-US"/>
+        </w:rPr>
         <w:lastRenderedPageBreak/>
-        <w:t xml:space="preserve">UniBot - </w:t>
-      </w:r>
-      <w:r>
-        <w:t>Synopsis</w:t>
-      </w:r>
-    </w:p>
-    <w:p>
-      <w:pPr>
-        <w:rPr>
-          <w:lang w:val="en-US"/>
-        </w:rPr>
-      </w:pPr>
-    </w:p>
-    <w:p>
-      <w:pPr>
-        <w:pStyle w:val="Heading1"/>
-        <w:rPr>
-          <w:lang w:val="en-US"/>
-        </w:rPr>
-      </w:pPr>
-      <w:r>
-        <w:rPr>
-          <w:lang w:val="en-US"/>
-        </w:rPr>
-        <w:t>Introduction</w:t>
-      </w:r>
-    </w:p>
-    <w:p>
-      <w:pPr>
-        <w:rPr>
-          <w:lang w:val="en-US"/>
-        </w:rPr>
-      </w:pPr>
-      <w:r>
-        <w:rPr>
-          <w:lang w:val="en-US"/>
-        </w:rPr>
-        <w:t>UniBot possess the immense power, technology and structure to transform our world into a simple, quick and effortlessly functioning one. UniBot has been engineered to provide the most beneficial and efficient design ranging from exterior design, mechanical design to software design. Most of the swarm robots can form only 2D structure, but UniBot can form and operate 3D structures, making it as a real world functional robot.</w:t>
+        <w:t>provide the most beneficial and efficient design ranging from exterior design, mechanical design to software design. Most of the swarm robots can form only 2D structure, but UniBot can form and operate 3D structures, making it as a real world functional robot.</w:t>
       </w:r>
     </w:p>
     <w:p>
@@ -1211,7 +1068,6 @@
           <w:noProof/>
           <w:lang w:eastAsia="en-IN"/>
         </w:rPr>
-        <w:lastRenderedPageBreak/>
         <w:drawing>
           <wp:inline distT="0" distB="0" distL="0" distR="0">
             <wp:extent cx="2385983" cy="1486894"/>
@@ -1312,6 +1168,7 @@
         <w:rPr>
           <w:lang w:val="en-US"/>
         </w:rPr>
+        <w:lastRenderedPageBreak/>
         <w:t>Methodology</w:t>
       </w:r>
     </w:p>
@@ -1432,7 +1289,6 @@
           <w:noProof/>
           <w:lang w:eastAsia="en-IN"/>
         </w:rPr>
-        <w:lastRenderedPageBreak/>
         <w:drawing>
           <wp:inline distT="0" distB="0" distL="0" distR="0" wp14:anchorId="0159172E" wp14:editId="58B8B2A9">
             <wp:extent cx="4587903" cy="2372229"/>
@@ -1516,7 +1372,14 @@
         <w:rPr>
           <w:lang w:val="en-US"/>
         </w:rPr>
-        <w:t xml:space="preserve">2-wheel rotational movement with the help of 2 AD002 servos and 2 N20 Geared motors. These servos and motors were chosen to provide additional torque to move easily under high pressure or force. </w:t>
+        <w:t xml:space="preserve">2-wheel rotational movement with the help of 2 AD002 servos and 2 N20 Geared motors. These servos and motors were chosen </w:t>
+      </w:r>
+      <w:r>
+        <w:rPr>
+          <w:lang w:val="en-US"/>
+        </w:rPr>
+        <w:lastRenderedPageBreak/>
+        <w:t xml:space="preserve">to provide additional torque to move easily under high pressure or force. </w:t>
       </w:r>
       <w:r>
         <w:rPr>
@@ -1640,44 +1503,41 @@
         <w:t xml:space="preserve"> it has engineered in the present to adapt the self-linking technology in the future progresses. Presently, there are two most efficient models that we could adapt in the future to implement this key technology, that is Electro-magnetism and Electro-Perman</w:t>
       </w:r>
       <w:r>
-        <w:t>ent-</w:t>
-      </w:r>
-      <w:r>
+        <w:t>ent-Magnetism. The main reason for choosing non-contact attaching is that it does not require any mechanical systems which really reduces the complexity of project which promotes the scope of size reduction of the project for future expectations.</w:t>
+      </w:r>
+    </w:p>
+    <w:p/>
+    <w:p>
+      <w:pPr>
+        <w:pStyle w:val="Heading1"/>
+        <w:rPr>
+          <w:sz w:val="36"/>
+        </w:rPr>
+      </w:pPr>
+      <w:r>
+        <w:rPr>
+          <w:sz w:val="36"/>
+        </w:rPr>
+        <w:t>Microcontroller unit</w:t>
+      </w:r>
+    </w:p>
+    <w:p>
+      <w:r>
+        <w:t xml:space="preserve">The main MCU of the project, ESP8266, is fully customized and used as a standalone board along with integrated L293D motor driver, with MicroPython runtime framework. ESP has been chosen for its single digit standby current consumption and excellent Wi-Fi connectivity manipulation </w:t>
+      </w:r>
+      <w:r>
+        <w:t>and user friendly boot loading interface along with low latency communications.</w:t>
+      </w:r>
+    </w:p>
+    <w:p>
+      <w:pPr>
+        <w:pStyle w:val="NormalWeb"/>
+      </w:pPr>
+      <w:r>
+        <w:rPr>
+          <w:noProof/>
+        </w:rPr>
         <w:lastRenderedPageBreak/>
-        <w:t>Magnetism. The main reason for choosing non-contact attaching is that it does not require any mechanical systems which really reduces the complexity of project which promotes the scope of size reduction of the project for future expectations.</w:t>
-      </w:r>
-    </w:p>
-    <w:p/>
-    <w:p>
-      <w:pPr>
-        <w:pStyle w:val="Heading1"/>
-        <w:rPr>
-          <w:sz w:val="36"/>
-        </w:rPr>
-      </w:pPr>
-      <w:r>
-        <w:rPr>
-          <w:sz w:val="36"/>
-        </w:rPr>
-        <w:t>Microcontroller unit</w:t>
-      </w:r>
-    </w:p>
-    <w:p>
-      <w:r>
-        <w:t xml:space="preserve">The main MCU of the project, ESP8266, is fully customized and used as a standalone board along with integrated L293D motor driver, with MicroPython runtime framework. ESP has been chosen for its single digit standby current consumption and excellent Wi-Fi connectivity manipulation </w:t>
-      </w:r>
-      <w:r>
-        <w:t>and user friendly boot loading interface along with low latency communications.</w:t>
-      </w:r>
-    </w:p>
-    <w:p>
-      <w:pPr>
-        <w:pStyle w:val="NormalWeb"/>
-      </w:pPr>
-      <w:r>
-        <w:rPr>
-          <w:noProof/>
-        </w:rPr>
         <w:drawing>
           <wp:inline distT="0" distB="0" distL="0" distR="0">
             <wp:extent cx="2599569" cy="1661823"/>
@@ -1955,7 +1815,6 @@
         <w:rPr>
           <w:sz w:val="36"/>
         </w:rPr>
-        <w:lastRenderedPageBreak/>
         <w:t>Software/Coding</w:t>
       </w:r>
     </w:p>
@@ -2008,6 +1867,7 @@
         <w:pStyle w:val="Heading1"/>
       </w:pPr>
       <w:r>
+        <w:lastRenderedPageBreak/>
         <w:t>Challenges</w:t>
       </w:r>
     </w:p>
@@ -2071,11 +1931,7 @@
         </w:numPr>
       </w:pPr>
       <w:r>
-        <w:t xml:space="preserve">Human-Robot Interaction: In some applications, self-assembling robots may need to interact with humans or other robots in a collaborative manner. Designing intuitive interfaces and developing algorithms for human-robot interaction (HRI) </w:t>
-      </w:r>
-      <w:r>
-        <w:lastRenderedPageBreak/>
-        <w:t xml:space="preserve">is essential for </w:t>
+        <w:t xml:space="preserve">Human-Robot Interaction: In some applications, self-assembling robots may need to interact with humans or other robots in a collaborative manner. Designing intuitive interfaces and developing algorithms for human-robot interaction (HRI) is essential for </w:t>
       </w:r>
       <w:r>
         <w:t>enabling seamless collaboration, which is a crucial operation mechanism of a self-assembling robot.</w:t>
@@ -2127,6 +1983,7 @@
         <w:jc w:val="center"/>
       </w:pPr>
       <w:r>
+        <w:lastRenderedPageBreak/>
         <w:t xml:space="preserve">M-Blocks 2.0: these robots generate movement in single direction through </w:t>
       </w:r>
       <w:r>
@@ -2162,7 +2019,7 @@
             <v:path o:extrusionok="f" gradientshapeok="t" o:connecttype="rect"/>
             <o:lock v:ext="edit" aspectratio="t"/>
           </v:shapetype>
-          <v:shape id="_x0000_i1025" type="#_x0000_t75" style="width:226.3pt;height:126.25pt">
+          <v:shape id="_x0000_i1025" type="#_x0000_t75" style="width:226.2pt;height:126.35pt">
             <v:imagedata r:id="rId16" o:title="M-Blocks 2"/>
           </v:shape>
         </w:pict>
@@ -2272,7 +2129,6 @@
           <w:noProof/>
           <w:lang w:eastAsia="en-IN"/>
         </w:rPr>
-        <w:lastRenderedPageBreak/>
         <w:drawing>
           <wp:inline distT="0" distB="0" distL="0" distR="0">
             <wp:extent cx="2814452" cy="1578635"/>
@@ -2359,7 +2215,11 @@
         <w:t xml:space="preserve"> </w:t>
       </w:r>
       <w:r>
-        <w:t>One of the most immediate applications of self-assembling robots is in disaster response. These robots can autonomously navigate through debris and assemble into structures to aid in search and rescue missions. Their ability to adapt to changing environments and collaborate with each other can significantly improve the efficiency and effectiveness of rescue operations in scenarios such as earthquakes, hurricanes, or industrial accidents.</w:t>
+        <w:t xml:space="preserve">One of the most immediate applications of self-assembling robots is in disaster response. These robots can autonomously navigate through debris </w:t>
+      </w:r>
+      <w:r>
+        <w:lastRenderedPageBreak/>
+        <w:t>and assemble into structures to aid in search and rescue missions. Their ability to adapt to changing environments and collaborate with each other can significantly improve the efficiency and effectiveness of rescue operations in scenarios such as earthquakes, hurricanes, or industrial accidents.</w:t>
       </w:r>
     </w:p>
     <w:p/>
@@ -2425,11 +2285,7 @@
         <w:t>:</w:t>
       </w:r>
       <w:r>
-        <w:t xml:space="preserve"> In the healthcare sector, self-assembling robots can be utilized for targeted drug delivery, minimally invasive surgeries, and even tissue engineering. These robots can navigate through the body, assemble into complex structures, and perform precise tasks with minimal intervention. This technology has the potential to revolutionize </w:t>
-      </w:r>
-      <w:r>
-        <w:lastRenderedPageBreak/>
-        <w:t>medical treatments by improving precision, reducing recovery times, and minimizing the risk of complications.</w:t>
+        <w:t xml:space="preserve"> In the healthcare sector, self-assembling robots can be utilized for targeted drug delivery, minimally invasive surgeries, and even tissue engineering. These robots can navigate through the body, assemble into complex structures, and perform precise tasks with minimal intervention. This technology has the potential to revolutionize medical treatments by improving precision, reducing recovery times, and minimizing the risk of complications.</w:t>
       </w:r>
     </w:p>
     <w:p/>
@@ -2489,7 +2345,11 @@
         <w:t>:</w:t>
       </w:r>
       <w:r>
-        <w:t xml:space="preserve"> In the field of space exploration, self-assembling robots hold promise for autonomous construction of habitats and infrastructure on other planets or moons. By leveraging local resources and autonomously assembling structures, these robots can enable long-term human habitation beyond Earth, supporting scientific research, resource extraction, and colonization efforts.</w:t>
+        <w:t xml:space="preserve"> In the field of space exploration, self-assembling robots hold promise for autonomous construction of habitats and infrastructure on other planets or moons. By leveraging local resources and autonomously assembling structures, these </w:t>
+      </w:r>
+      <w:r>
+        <w:lastRenderedPageBreak/>
+        <w:t>robots can enable long-term human habitation beyond Earth, supporting scientific research, resource extraction, and colonization efforts.</w:t>
       </w:r>
     </w:p>
     <w:p/>
@@ -2558,11 +2418,7 @@
         <w:t xml:space="preserve"> This helps the bot to recharge itself when exposed to sunlight. This may not work under all conditions or environments, but it does make a change that brings a branch of sustainability into our robot, making it eco-friendly for all environments with easy adaptation.</w:t>
       </w:r>
       <w:r>
-        <w:t xml:space="preserve"> The next key in this project is the AI integration. Harnessing the power of AI, once it is well trained and ready for industrial </w:t>
-      </w:r>
-      <w:r>
-        <w:lastRenderedPageBreak/>
-        <w:t>action, the UniBots will effortlessly form the most beautiful and complex structure without any human intervention.</w:t>
+        <w:t xml:space="preserve"> The next key in this project is the AI integration. Harnessing the power of AI, once it is well trained and ready for industrial action, the UniBots will effortlessly form the most beautiful and complex structure without any human intervention.</w:t>
       </w:r>
     </w:p>
     <w:p>
@@ -2607,7 +2463,11 @@
     </w:p>
     <w:p>
       <w:r>
-        <w:t>In conclusion, self-assembling robots represent a paradigm shift in robotics. Overall, the social impact and innovation potential of self-assembling robots are vast, offering transformative capabilities across various industries and domains. By harnessing the power of autonomy, adaptability, and collaboration, these machines have the potential to reshape the way we manufacture products, construct buildings, caring for environmental co</w:t>
+        <w:t xml:space="preserve">In conclusion, self-assembling robots represent a paradigm shift in robotics. Overall, the social impact and innovation potential of self-assembling robots are vast, offering transformative capabilities across various industries and domains. By harnessing the power of autonomy, adaptability, and collaboration, these machines have the potential to </w:t>
+      </w:r>
+      <w:r>
+        <w:lastRenderedPageBreak/>
+        <w:t>reshape the way we manufacture products, construct buildings, caring for environmental co</w:t>
       </w:r>
       <w:r>
         <w:t>nservation, explore the cosmos,</w:t>
@@ -4794,6 +4654,7 @@
   <w:style w:type="character" w:default="1" w:styleId="DefaultParagraphFont">
     <w:name w:val="Default Paragraph Font"/>
     <w:uiPriority w:val="1"/>
+    <w:semiHidden/>
     <w:unhideWhenUsed/>
   </w:style>
   <w:style w:type="table" w:default="1" w:styleId="TableNormal">
@@ -5584,7 +5445,7 @@
 </file>
 
 <file path=customXml/itemProps1.xml><?xml version="1.0" encoding="utf-8"?>
-<ds:datastoreItem xmlns:ds="http://schemas.openxmlformats.org/officeDocument/2006/customXml" ds:itemID="{73450FD1-E8B0-429F-82B3-7B191421DA2A}">
+<ds:datastoreItem xmlns:ds="http://schemas.openxmlformats.org/officeDocument/2006/customXml" ds:itemID="{67A62214-6FF4-42CB-A03A-BBEE64A3F289}">
   <ds:schemaRefs>
     <ds:schemaRef ds:uri="http://schemas.openxmlformats.org/officeDocument/2006/bibliography"/>
   </ds:schemaRefs>

</xml_diff>